<commit_message>
fix(samples): demo package 01 routing lines use real sub-doc wording (select only one, please complete Part X of Section N)
Co-Authored-By: Claude Opus 5.5 <noreply@anthropic.com>
</commit_message>
<xml_diff>
--- a/fixtures/package/design/northgate-iii/01-NG3-Subscription-Agreement.docx
+++ b/fixtures/package/design/northgate-iii/01-NG3-Subscription-Agreement.docx
@@ -572,7 +572,7 @@
     </w:p>
     <w:p>
       <w:r>
-        <w:t>The Investor shall indicate the jurisdiction in which it is formed, organized or resident by checking one box below. The General Partner will accept subscriptions only from Investors in the jurisdictions listed, unless it consents in writing to another jurisdiction after receiving advice of counsel.</w:t>
+        <w:t>The Investor shall indicate the jurisdiction in which it is formed, organized or resident (select only one). The General Partner will accept subscriptions only from Investors in the jurisdictions listed, unless it consents in writing to another jurisdiction after receiving advice of counsel.</w:t>
       </w:r>
     </w:p>
     <w:tbl>
@@ -601,7 +601,7 @@
               <w:rPr>
                 <w:b/>
               </w:rPr>
-              <w:t>Check one</w:t>
+              <w:t>Select one</w:t>
             </w:r>
           </w:p>
         </w:tc>
@@ -1143,7 +1143,7 @@
     </w:p>
     <w:p>
       <w:r>
-        <w:t>The Investor shall indicate its type by checking one box below. The type determines the information and documents that the Investor must deliver under Annex C and Annex D.</w:t>
+        <w:t>INVESTOR TYPE (select only one). The type determines the information and documents that the Investor must deliver under Annex C and Annex D.</w:t>
       </w:r>
     </w:p>
     <w:tbl>
@@ -1153,13 +1153,14 @@
         <w:tblLook w:firstColumn="1" w:firstRow="1" w:lastColumn="0" w:lastRow="0" w:noHBand="0" w:noVBand="1" w:val="04A0"/>
       </w:tblPr>
       <w:tblGrid>
-        <w:gridCol w:w="4320"/>
-        <w:gridCol w:w="4320"/>
+        <w:gridCol w:w="2880"/>
+        <w:gridCol w:w="2880"/>
+        <w:gridCol w:w="2880"/>
       </w:tblGrid>
       <w:tr>
         <w:tc>
           <w:tcPr>
-            <w:tcW w:type="dxa" w:w="4320"/>
+            <w:tcW w:type="dxa" w:w="2880"/>
           </w:tcPr>
           <w:p>
             <w:r>
@@ -1171,13 +1172,13 @@
               <w:rPr>
                 <w:b/>
               </w:rPr>
-              <w:t>Check one</w:t>
+              <w:t>Select one</w:t>
             </w:r>
           </w:p>
         </w:tc>
         <w:tc>
           <w:tcPr>
-            <w:tcW w:type="dxa" w:w="4320"/>
+            <w:tcW w:type="dxa" w:w="2880"/>
           </w:tcPr>
           <w:p>
             <w:r>
@@ -1193,11 +1194,29 @@
             </w:r>
           </w:p>
         </w:tc>
+        <w:tc>
+          <w:tcPr>
+            <w:tcW w:type="dxa" w:w="2880"/>
+          </w:tcPr>
+          <w:p>
+            <w:r>
+              <w:rPr>
+                <w:b/>
+              </w:rPr>
+            </w:r>
+            <w:r>
+              <w:rPr>
+                <w:b/>
+              </w:rPr>
+              <w:t>Instructions</w:t>
+            </w:r>
+          </w:p>
+        </w:tc>
       </w:tr>
       <w:tr>
         <w:tc>
           <w:tcPr>
-            <w:tcW w:type="dxa" w:w="4320"/>
+            <w:tcW w:type="dxa" w:w="2880"/>
           </w:tcPr>
           <w:p>
             <w:r/>
@@ -1208,7 +1227,7 @@
         </w:tc>
         <w:tc>
           <w:tcPr>
-            <w:tcW w:type="dxa" w:w="4320"/>
+            <w:tcW w:type="dxa" w:w="2880"/>
           </w:tcPr>
           <w:p>
             <w:r/>
@@ -1217,11 +1236,22 @@
             </w:r>
           </w:p>
         </w:tc>
+        <w:tc>
+          <w:tcPr>
+            <w:tcW w:type="dxa" w:w="2880"/>
+          </w:tcPr>
+          <w:p>
+            <w:r/>
+            <w:r>
+              <w:t>Please complete Part A of Section 6</w:t>
+            </w:r>
+          </w:p>
+        </w:tc>
       </w:tr>
       <w:tr>
         <w:tc>
           <w:tcPr>
-            <w:tcW w:type="dxa" w:w="4320"/>
+            <w:tcW w:type="dxa" w:w="2880"/>
           </w:tcPr>
           <w:p>
             <w:r/>
@@ -1232,7 +1262,7 @@
         </w:tc>
         <w:tc>
           <w:tcPr>
-            <w:tcW w:type="dxa" w:w="4320"/>
+            <w:tcW w:type="dxa" w:w="2880"/>
           </w:tcPr>
           <w:p>
             <w:r/>
@@ -1241,11 +1271,22 @@
             </w:r>
           </w:p>
         </w:tc>
+        <w:tc>
+          <w:tcPr>
+            <w:tcW w:type="dxa" w:w="2880"/>
+          </w:tcPr>
+          <w:p>
+            <w:r/>
+            <w:r>
+              <w:t>Please complete Part A of Section 6</w:t>
+            </w:r>
+          </w:p>
+        </w:tc>
       </w:tr>
       <w:tr>
         <w:tc>
           <w:tcPr>
-            <w:tcW w:type="dxa" w:w="4320"/>
+            <w:tcW w:type="dxa" w:w="2880"/>
           </w:tcPr>
           <w:p>
             <w:r/>
@@ -1256,7 +1297,7 @@
         </w:tc>
         <w:tc>
           <w:tcPr>
-            <w:tcW w:type="dxa" w:w="4320"/>
+            <w:tcW w:type="dxa" w:w="2880"/>
           </w:tcPr>
           <w:p>
             <w:r/>
@@ -1265,11 +1306,22 @@
             </w:r>
           </w:p>
         </w:tc>
+        <w:tc>
+          <w:tcPr>
+            <w:tcW w:type="dxa" w:w="2880"/>
+          </w:tcPr>
+          <w:p>
+            <w:r/>
+            <w:r>
+              <w:t>Please complete Part A of Section 6 and Item 8 of Annex A</w:t>
+            </w:r>
+          </w:p>
+        </w:tc>
       </w:tr>
       <w:tr>
         <w:tc>
           <w:tcPr>
-            <w:tcW w:type="dxa" w:w="4320"/>
+            <w:tcW w:type="dxa" w:w="2880"/>
           </w:tcPr>
           <w:p>
             <w:r/>
@@ -1280,7 +1332,7 @@
         </w:tc>
         <w:tc>
           <w:tcPr>
-            <w:tcW w:type="dxa" w:w="4320"/>
+            <w:tcW w:type="dxa" w:w="2880"/>
           </w:tcPr>
           <w:p>
             <w:r/>
@@ -1289,11 +1341,22 @@
             </w:r>
           </w:p>
         </w:tc>
+        <w:tc>
+          <w:tcPr>
+            <w:tcW w:type="dxa" w:w="2880"/>
+          </w:tcPr>
+          <w:p>
+            <w:r/>
+            <w:r>
+              <w:t>Please complete Part A of Section 6 and Item 8 of Annex A</w:t>
+            </w:r>
+          </w:p>
+        </w:tc>
       </w:tr>
       <w:tr>
         <w:tc>
           <w:tcPr>
-            <w:tcW w:type="dxa" w:w="4320"/>
+            <w:tcW w:type="dxa" w:w="2880"/>
           </w:tcPr>
           <w:p>
             <w:r/>
@@ -1304,7 +1367,7 @@
         </w:tc>
         <w:tc>
           <w:tcPr>
-            <w:tcW w:type="dxa" w:w="4320"/>
+            <w:tcW w:type="dxa" w:w="2880"/>
           </w:tcPr>
           <w:p>
             <w:r/>
@@ -1313,11 +1376,22 @@
             </w:r>
           </w:p>
         </w:tc>
+        <w:tc>
+          <w:tcPr>
+            <w:tcW w:type="dxa" w:w="2880"/>
+          </w:tcPr>
+          <w:p>
+            <w:r/>
+            <w:r>
+              <w:t>Please complete Part A of Section 6 and Item 8 of Annex A</w:t>
+            </w:r>
+          </w:p>
+        </w:tc>
       </w:tr>
       <w:tr>
         <w:tc>
           <w:tcPr>
-            <w:tcW w:type="dxa" w:w="4320"/>
+            <w:tcW w:type="dxa" w:w="2880"/>
           </w:tcPr>
           <w:p>
             <w:r/>
@@ -1328,7 +1402,7 @@
         </w:tc>
         <w:tc>
           <w:tcPr>
-            <w:tcW w:type="dxa" w:w="4320"/>
+            <w:tcW w:type="dxa" w:w="2880"/>
           </w:tcPr>
           <w:p>
             <w:r/>
@@ -1337,11 +1411,22 @@
             </w:r>
           </w:p>
         </w:tc>
+        <w:tc>
+          <w:tcPr>
+            <w:tcW w:type="dxa" w:w="2880"/>
+          </w:tcPr>
+          <w:p>
+            <w:r/>
+            <w:r>
+              <w:t>Please complete Part A and Part B of Section 6</w:t>
+            </w:r>
+          </w:p>
+        </w:tc>
       </w:tr>
       <w:tr>
         <w:tc>
           <w:tcPr>
-            <w:tcW w:type="dxa" w:w="4320"/>
+            <w:tcW w:type="dxa" w:w="2880"/>
           </w:tcPr>
           <w:p>
             <w:r/>
@@ -1352,7 +1437,7 @@
         </w:tc>
         <w:tc>
           <w:tcPr>
-            <w:tcW w:type="dxa" w:w="4320"/>
+            <w:tcW w:type="dxa" w:w="2880"/>
           </w:tcPr>
           <w:p>
             <w:r/>
@@ -1361,11 +1446,22 @@
             </w:r>
           </w:p>
         </w:tc>
+        <w:tc>
+          <w:tcPr>
+            <w:tcW w:type="dxa" w:w="2880"/>
+          </w:tcPr>
+          <w:p>
+            <w:r/>
+            <w:r>
+              <w:t>Please complete Part A and Part B of Section 6</w:t>
+            </w:r>
+          </w:p>
+        </w:tc>
       </w:tr>
       <w:tr>
         <w:tc>
           <w:tcPr>
-            <w:tcW w:type="dxa" w:w="4320"/>
+            <w:tcW w:type="dxa" w:w="2880"/>
           </w:tcPr>
           <w:p>
             <w:r/>
@@ -1376,7 +1472,7 @@
         </w:tc>
         <w:tc>
           <w:tcPr>
-            <w:tcW w:type="dxa" w:w="4320"/>
+            <w:tcW w:type="dxa" w:w="2880"/>
           </w:tcPr>
           <w:p>
             <w:r/>
@@ -1385,11 +1481,22 @@
             </w:r>
           </w:p>
         </w:tc>
+        <w:tc>
+          <w:tcPr>
+            <w:tcW w:type="dxa" w:w="2880"/>
+          </w:tcPr>
+          <w:p>
+            <w:r/>
+            <w:r>
+              <w:t>Please complete Part A and Part B of Section 6</w:t>
+            </w:r>
+          </w:p>
+        </w:tc>
       </w:tr>
       <w:tr>
         <w:tc>
           <w:tcPr>
-            <w:tcW w:type="dxa" w:w="4320"/>
+            <w:tcW w:type="dxa" w:w="2880"/>
           </w:tcPr>
           <w:p>
             <w:r/>
@@ -1400,7 +1507,7 @@
         </w:tc>
         <w:tc>
           <w:tcPr>
-            <w:tcW w:type="dxa" w:w="4320"/>
+            <w:tcW w:type="dxa" w:w="2880"/>
           </w:tcPr>
           <w:p>
             <w:r/>
@@ -1409,11 +1516,22 @@
             </w:r>
           </w:p>
         </w:tc>
+        <w:tc>
+          <w:tcPr>
+            <w:tcW w:type="dxa" w:w="2880"/>
+          </w:tcPr>
+          <w:p>
+            <w:r/>
+            <w:r>
+              <w:t>Please complete Part A of Section 6 and Item 6 of Annex A</w:t>
+            </w:r>
+          </w:p>
+        </w:tc>
       </w:tr>
       <w:tr>
         <w:tc>
           <w:tcPr>
-            <w:tcW w:type="dxa" w:w="4320"/>
+            <w:tcW w:type="dxa" w:w="2880"/>
           </w:tcPr>
           <w:p>
             <w:r/>
@@ -1424,12 +1542,23 @@
         </w:tc>
         <w:tc>
           <w:tcPr>
-            <w:tcW w:type="dxa" w:w="4320"/>
+            <w:tcW w:type="dxa" w:w="2880"/>
           </w:tcPr>
           <w:p>
             <w:r/>
             <w:r>
               <w:t>Other entity (please describe)</w:t>
+            </w:r>
+          </w:p>
+        </w:tc>
+        <w:tc>
+          <w:tcPr>
+            <w:tcW w:type="dxa" w:w="2880"/>
+          </w:tcPr>
+          <w:p>
+            <w:r/>
+            <w:r>
+              <w:t>Please complete Part A of Section 6 and Item 8 of Annex A</w:t>
             </w:r>
           </w:p>
         </w:tc>
@@ -2002,7 +2131,7 @@
     </w:p>
     <w:p>
       <w:r>
-        <w:t>The Investor shall indicate in Item 6 of Annex A whether it is, or is acting on behalf of, a Benefit Plan Investor. If the Investor is a Benefit Plan Investor, complete Annex F. The additional representations that a Benefit Plan Investor must make are set out in Annex F (ERISA Representations).</w:t>
+        <w:t>The Investor shall indicate in Item 6 of Annex A whether it is, or is acting on behalf of, a Benefit Plan Investor. If the Investor is a Benefit Plan Investor, please complete Annex F. The additional representations that a Benefit Plan Investor must make are set out in Annex F (ERISA Representations).</w:t>
       </w:r>
     </w:p>
     <w:p>
@@ -3391,7 +3520,7 @@
     <w:p/>
     <w:p>
       <w:r>
-        <w:t>If the Investor is not a Qualified Purchaser, skip Item 5 and go to Item 6.</w:t>
+        <w:t>If the Investor is not a Qualified Purchaser, please skip Item 5 and proceed to Item 6.</w:t>
       </w:r>
     </w:p>
     <w:p>

</xml_diff>